<commit_message>
chore(lab-2): rebuild the submission package
</commit_message>
<xml_diff>
--- a/labs/02-jtbd-value-proposition/docs/report/ПР02_Соколов_ІП-33.docx
+++ b/labs/02-jtbd-value-proposition/docs/report/ПР02_Соколов_ІП-33.docx
@@ -463,7 +463,7 @@
         <w:pStyle w:val="FirstParagraph"/>
       </w:pPr>
       <w:r>
-        <w:t xml:space="preserve">Інтерв’ю практичної роботи № 1 були зосереджені на поточній поведінці й болях, а не на моменті перемикання між рішеннями. Тому з прототипами обох персон проведено короткі повторні розмови за методом Switch Interview [3]: 01.10.2026 з Аліною (15 хв) і 02.10.2026 з Іриною (17 хв), обидві онлайн у Google Meet. Розмова будувалась навколо конкретного дня, коли учасниця почала шукати інший спосіб вести облік, і чотирьох сил, що штовхали до зміни або стримували її.</w:t>
+        <w:t xml:space="preserve">Інтерв’ю практичної роботи № 1 були зосереджені на поточній поведінці й болях, а не на моменті перемикання між рішеннями. Тому з прототипами обох персон проведено короткі повторні онлайн-розмови за методом Switch Interview [2]. Розмова будувалась навколо конкретного дня, коли учасниця почала шукати інший спосіб вести облік, і чотирьох сил, що штовхали до зміни або стримували її.</w:t>
       </w:r>
     </w:p>
     <w:p>
@@ -483,9 +483,9 @@
         <w:tblLook w:firstRow="1" w:lastRow="0" w:firstColumn="0" w:lastColumn="0" w:noHBand="0" w:noVBand="0" w:val="0020"/>
       </w:tblPr>
       <w:tblGrid>
-        <w:gridCol w:w="950"/>
-        <w:gridCol w:w="3484"/>
-        <w:gridCol w:w="3484"/>
+        <w:gridCol w:w="1346"/>
+        <w:gridCol w:w="3247"/>
+        <w:gridCol w:w="3326"/>
       </w:tblGrid>
       <w:tr>
         <w:trPr>
@@ -571,7 +571,7 @@
               <w:jc w:val="left"/>
             </w:pPr>
             <w:r>
-              <w:t xml:space="preserve">«Минулої зими світло вимикали за графіком, я переписувала розклад тричі на тиждень, а в неділю ще й зводила оплати. Я просто сіла й заплакала над журналом»</w:t>
+              <w:t xml:space="preserve">«Минулої зими світло вимикали за графіком, я переписувала розклад тричі на тиждень, а в неділю ще й зводила оплати. Тоді й подумала, що журнал уже не справляється»</w:t>
             </w:r>
           </w:p>
         </w:tc>
@@ -711,6 +711,7 @@
     <w:p>
       <w:pPr>
         <w:pStyle w:val="Heading3"/>
+        <w:spacing w:before="420"/>
       </w:pPr>
       <w:r>
         <w:t xml:space="preserve">Формулювання Job Statements</w:t>
@@ -721,7 +722,7 @@
         <w:pStyle w:val="FirstParagraph"/>
       </w:pPr>
       <w:r>
-        <w:t xml:space="preserve">На основі інтерв’ю обох практичних робіт і відкритих відповідей опитування сформульовано 10 Job Statements за форматом «Коли…, я хочу…, щоб…» [1], [2]. Пріоритет визначено за частотою теми в affinity map і опитуванні та за тим, наскільки погано її закривають поточні рішення.</w:t>
+        <w:t xml:space="preserve">На основі інтерв’ю обох практичних робіт і відкритих відповідей опитування сформульовано 10 Job Statements за форматом «Коли…, я хочу…, щоб…» [1]. Пріоритет визначено за частотою теми в affinity map і опитуванні та за тим, наскільки погано її закривають поточні рішення.</w:t>
       </w:r>
     </w:p>
     <w:p>
@@ -741,11 +742,11 @@
         <w:tblLook w:firstRow="1" w:lastRow="0" w:firstColumn="0" w:lastColumn="0" w:noHBand="0" w:noVBand="0" w:val="0020"/>
       </w:tblPr>
       <w:tblGrid>
-        <w:gridCol w:w="396"/>
-        <w:gridCol w:w="950"/>
-        <w:gridCol w:w="1108"/>
-        <w:gridCol w:w="4435"/>
-        <w:gridCol w:w="1029"/>
+        <w:gridCol w:w="554"/>
+        <w:gridCol w:w="1346"/>
+        <w:gridCol w:w="1504"/>
+        <w:gridCol w:w="3009"/>
+        <w:gridCol w:w="1504"/>
       </w:tblGrid>
       <w:tr>
         <w:trPr>
@@ -1378,177 +1379,15 @@
           </w:p>
         </w:tc>
       </w:tr>
-      <w:tr>
-        <w:trPr>
-          <w:cantSplit/>
-        </w:trPr>
-        <w:tc>
-          <w:tcPr/>
-          <w:p>
-            <w:pPr>
-              <w:pStyle w:val="Compact"/>
-              <w:keepNext/>
-              <w:jc w:val="left"/>
-            </w:pPr>
-            <w:r>
-              <w:t xml:space="preserve">9</w:t>
-            </w:r>
-          </w:p>
-        </w:tc>
-        <w:tc>
-          <w:tcPr/>
-          <w:p>
-            <w:pPr>
-              <w:pStyle w:val="Compact"/>
-              <w:keepNext/>
-              <w:jc w:val="left"/>
-            </w:pPr>
-            <w:r>
-              <w:t xml:space="preserve">Ірина</w:t>
-            </w:r>
-          </w:p>
-        </w:tc>
-        <w:tc>
-          <w:tcPr/>
-          <w:p>
-            <w:pPr>
-              <w:pStyle w:val="Compact"/>
-              <w:keepNext/>
-              <w:jc w:val="left"/>
-            </w:pPr>
-            <w:r>
-              <w:t xml:space="preserve">Emotional</w:t>
-            </w:r>
-          </w:p>
-        </w:tc>
-        <w:tc>
-          <w:tcPr/>
-          <w:p>
-            <w:pPr>
-              <w:pStyle w:val="Compact"/>
-              <w:keepNext/>
-              <w:jc w:val="left"/>
-            </w:pPr>
-            <w:r>
-              <w:t xml:space="preserve">Коли я пробую нову програму, я хочу з першого разу розуміти, що робити, щоб не почуватися відсталою і не просити допомоги в сина</w:t>
-            </w:r>
-          </w:p>
-        </w:tc>
-        <w:tc>
-          <w:tcPr/>
-          <w:p>
-            <w:pPr>
-              <w:pStyle w:val="Compact"/>
-              <w:keepNext/>
-              <w:jc w:val="left"/>
-            </w:pPr>
-            <w:r>
-              <w:t xml:space="preserve">Med</w:t>
-            </w:r>
-          </w:p>
-        </w:tc>
-      </w:tr>
-      <w:tr>
-        <w:trPr>
-          <w:cantSplit/>
-        </w:trPr>
-        <w:tc>
-          <w:tcPr/>
-          <w:p>
-            <w:pPr>
-              <w:pStyle w:val="Compact"/>
-              <w:jc w:val="left"/>
-            </w:pPr>
-            <w:r>
-              <w:t xml:space="preserve">10</w:t>
-            </w:r>
-          </w:p>
-        </w:tc>
-        <w:tc>
-          <w:tcPr/>
-          <w:p>
-            <w:pPr>
-              <w:pStyle w:val="Compact"/>
-              <w:jc w:val="left"/>
-            </w:pPr>
-            <w:r>
-              <w:t xml:space="preserve">Ірина</w:t>
-            </w:r>
-          </w:p>
-        </w:tc>
-        <w:tc>
-          <w:tcPr/>
-          <w:p>
-            <w:pPr>
-              <w:pStyle w:val="Compact"/>
-              <w:jc w:val="left"/>
-            </w:pPr>
-            <w:r>
-              <w:t xml:space="preserve">Social</w:t>
-            </w:r>
-          </w:p>
-        </w:tc>
-        <w:tc>
-          <w:tcPr/>
-          <w:p>
-            <w:pPr>
-              <w:pStyle w:val="Compact"/>
-              <w:jc w:val="left"/>
-            </w:pPr>
-            <w:r>
-              <w:t xml:space="preserve">Коли батьки обирають репетитора для дитини, я хочу виглядати сучасною і надійною викладачкою, щоб вони залишались зі мною і рекомендували мене знайомим</w:t>
-            </w:r>
-          </w:p>
-        </w:tc>
-        <w:tc>
-          <w:tcPr/>
-          <w:p>
-            <w:pPr>
-              <w:pStyle w:val="Compact"/>
-              <w:jc w:val="left"/>
-            </w:pPr>
-            <w:r>
-              <w:t xml:space="preserve">Low</w:t>
-            </w:r>
-          </w:p>
-        </w:tc>
-      </w:tr>
     </w:tbl>
-    <w:p>
-      <w:pPr>
-        <w:pStyle w:val="BodyText"/>
-        <w:spacing w:before="240"/>
-      </w:pPr>
-      <w:r>
-        <w:t xml:space="preserve">Функціональних jobs шість, емоційних і соціальних – по два. Найвищий пріоритет мають jobs, пов’язані з грошима: облік оплат (1, 6) і нагадування про борг (2), а також емоційна робота 4. Вона пояснює, чому облік боргів болить сильніше, ніж має боліти суто технічна задача: проблема не в підрахунку, а в незручності нагадувати.</w:t>
-      </w:r>
-    </w:p>
-    <w:bookmarkEnd w:id="14"/>
-    <w:bookmarkEnd w:id="15"/>
-    <w:bookmarkStart w:id="16" w:name="four-forces-analysis"/>
-    <w:p>
-      <w:pPr>
-        <w:pStyle w:val="Heading1"/>
-      </w:pPr>
-      <w:r>
-        <w:t xml:space="preserve">2. Four Forces Analysis</w:t>
-      </w:r>
-    </w:p>
-    <w:p>
-      <w:pPr>
-        <w:pStyle w:val="FirstParagraph"/>
-      </w:pPr>
-      <w:r>
-        <w:t xml:space="preserve">Для аналізу чотирьох сил [3], [4] обрано три функціональні jobs, що покривають три найбільші кластери affinity map практичної роботи № 1: «Незручно нагадувати про гроші» (12 стікерів), «Облік розкиданий по інструментах» (11) і «Перенесення ламають розклад» (9).</w:t>
-      </w:r>
-    </w:p>
     <w:p>
       <w:pPr>
         <w:pStyle w:val="TableCaptionOwn"/>
         <w:keepNext/>
-      </w:pPr>
-      <w:r>
-        <w:t xml:space="preserve">Таблиця 3 – Four Forces для Job № 2: «Отримати борг без особистого нагадування»</w:t>
+        <w:pageBreakBefore/>
+      </w:pPr>
+      <w:r>
+        <w:t xml:space="preserve">Продовження таблиці 2</w:t>
       </w:r>
     </w:p>
     <w:tbl>
@@ -1559,8 +1398,11 @@
         <w:tblLook w:firstRow="1" w:lastRow="0" w:firstColumn="0" w:lastColumn="0" w:noHBand="0" w:noVBand="0" w:val="0020"/>
       </w:tblPr>
       <w:tblGrid>
-        <w:gridCol w:w="1742"/>
-        <w:gridCol w:w="6177"/>
+        <w:gridCol w:w="554"/>
+        <w:gridCol w:w="1346"/>
+        <w:gridCol w:w="1504"/>
+        <w:gridCol w:w="3009"/>
+        <w:gridCol w:w="1504"/>
       </w:tblGrid>
       <w:tr>
         <w:trPr>
@@ -1576,7 +1418,7 @@
               <w:jc w:val="center"/>
             </w:pPr>
             <w:r>
-              <w:t xml:space="preserve">Поле</w:t>
+              <w:t xml:space="preserve">№</w:t>
             </w:r>
           </w:p>
         </w:tc>
@@ -1589,173 +1431,221 @@
               <w:jc w:val="center"/>
             </w:pPr>
             <w:r>
-              <w:t xml:space="preserve">Зміст</w:t>
-            </w:r>
-          </w:p>
-        </w:tc>
-      </w:tr>
-      <w:tr>
-        <w:trPr>
-          <w:cantSplit/>
-        </w:trPr>
-        <w:tc>
-          <w:tcPr/>
-          <w:p>
-            <w:pPr>
-              <w:pStyle w:val="Compact"/>
-              <w:keepNext/>
-              <w:jc w:val="left"/>
-            </w:pPr>
-            <w:r>
-              <w:t xml:space="preserve">Push</w:t>
-            </w:r>
-          </w:p>
-        </w:tc>
-        <w:tc>
-          <w:tcPr/>
-          <w:p>
-            <w:pPr>
-              <w:pStyle w:val="Compact"/>
-              <w:keepNext/>
-              <w:jc w:val="left"/>
-            </w:pPr>
-            <w:r>
-              <w:t xml:space="preserve">1. «Писати мамі учня, що вона винна за три заняття, – це для мене найгірше» (Аліна). 2. «У березні я помітила, що Даня не платив три тижні, тільки коли рахувала дохід за місяць» (Аліна). 3. «Незручно нагадувати давнім учням, вони ж уже як свої» (Ірина). 4. Аліна втрачає до 1–2 оплат на місяць, бо відкладає нагадування</w:t>
-            </w:r>
-          </w:p>
-        </w:tc>
-      </w:tr>
-      <w:tr>
-        <w:trPr>
-          <w:cantSplit/>
-        </w:trPr>
-        <w:tc>
-          <w:tcPr/>
-          <w:p>
-            <w:pPr>
-              <w:pStyle w:val="Compact"/>
-              <w:keepNext/>
-              <w:jc w:val="left"/>
-            </w:pPr>
-            <w:r>
-              <w:t xml:space="preserve">Pull</w:t>
-            </w:r>
-          </w:p>
-        </w:tc>
-        <w:tc>
-          <w:tcPr/>
-          <w:p>
-            <w:pPr>
-              <w:pStyle w:val="Compact"/>
-              <w:keepNext/>
-              <w:jc w:val="left"/>
-            </w:pPr>
-            <w:r>
-              <w:t xml:space="preserve">Нагадування, що приходять «не від мене»: репетитор лише бачить, що борг погашено. Уявне краще майбутнє – «мені навіть не треба нагадувати про гроші самій»</w:t>
-            </w:r>
-          </w:p>
-        </w:tc>
-      </w:tr>
-      <w:tr>
-        <w:trPr>
-          <w:cantSplit/>
-        </w:trPr>
-        <w:tc>
-          <w:tcPr/>
-          <w:p>
-            <w:pPr>
-              <w:pStyle w:val="Compact"/>
-              <w:keepNext/>
-              <w:jc w:val="left"/>
-            </w:pPr>
-            <w:r>
-              <w:t xml:space="preserve">Anxiety</w:t>
-            </w:r>
-          </w:p>
-        </w:tc>
-        <w:tc>
-          <w:tcPr/>
-          <w:p>
-            <w:pPr>
-              <w:pStyle w:val="Compact"/>
-              <w:keepNext/>
-              <w:jc w:val="left"/>
-            </w:pPr>
-            <w:r>
-              <w:t xml:space="preserve">1. «Якщо бот напише мамі якось не так, вийде ще гірше, ніж коли пишу я» (Аліна). 2. Страх, що автоматичне нагадування виглядатиме як недовіра до давніх учнів. 3. Учні можуть ігнорувати повідомлення бота</w:t>
-            </w:r>
-          </w:p>
-        </w:tc>
-      </w:tr>
-      <w:tr>
-        <w:trPr>
-          <w:cantSplit/>
-        </w:trPr>
-        <w:tc>
-          <w:tcPr/>
-          <w:p>
-            <w:pPr>
-              <w:pStyle w:val="Compact"/>
-              <w:keepNext/>
-              <w:jc w:val="left"/>
-            </w:pPr>
-            <w:r>
-              <w:t xml:space="preserve">Habit</w:t>
-            </w:r>
-          </w:p>
-        </w:tc>
-        <w:tc>
-          <w:tcPr/>
-          <w:p>
-            <w:pPr>
-              <w:pStyle w:val="Compact"/>
-              <w:keepNext/>
-              <w:jc w:val="left"/>
-            </w:pPr>
-            <w:r>
-              <w:t xml:space="preserve">Повідомлення в Telegram пишеться за хвилину і «так роблять усі». Частину боргів закривають самі учні, тому здається, що система й так працює</w:t>
-            </w:r>
-          </w:p>
-        </w:tc>
-      </w:tr>
-      <w:tr>
-        <w:trPr>
-          <w:cantSplit/>
-        </w:trPr>
-        <w:tc>
-          <w:tcPr/>
-          <w:p>
-            <w:pPr>
-              <w:pStyle w:val="Compact"/>
-              <w:jc w:val="left"/>
-            </w:pPr>
-            <w:r>
-              <w:t xml:space="preserve">Продуктовий висновок</w:t>
-            </w:r>
-          </w:p>
-        </w:tc>
-        <w:tc>
-          <w:tcPr/>
-          <w:p>
-            <w:pPr>
-              <w:pStyle w:val="Compact"/>
-              <w:jc w:val="left"/>
-            </w:pPr>
-            <w:r>
-              <w:t xml:space="preserve">Push: показувати борг автоматично, щойно заняття відбулось, а не наприкінці місяця. Pull: нагадування надходить від імені Classno, репетитор його не пише. Anxiety: репетитор бачить і редагує текст нагадування перед першим надсиланням, тон за замовчуванням ввічливий і нейтральний. Habit: нагадування приходить у звичний учням Telegram, а не в новий застосунок</w:t>
+              <w:t xml:space="preserve">Persona</w:t>
+            </w:r>
+          </w:p>
+        </w:tc>
+        <w:tc>
+          <w:tcPr/>
+          <w:p>
+            <w:pPr>
+              <w:pStyle w:val="Compact"/>
+              <w:keepNext/>
+              <w:jc w:val="center"/>
+            </w:pPr>
+            <w:r>
+              <w:t xml:space="preserve">Тип Job</w:t>
+            </w:r>
+          </w:p>
+        </w:tc>
+        <w:tc>
+          <w:tcPr/>
+          <w:p>
+            <w:pPr>
+              <w:pStyle w:val="Compact"/>
+              <w:keepNext/>
+              <w:jc w:val="center"/>
+            </w:pPr>
+            <w:r>
+              <w:t xml:space="preserve">Job Statement</w:t>
+            </w:r>
+          </w:p>
+        </w:tc>
+        <w:tc>
+          <w:tcPr/>
+          <w:p>
+            <w:pPr>
+              <w:pStyle w:val="Compact"/>
+              <w:keepNext/>
+              <w:jc w:val="center"/>
+            </w:pPr>
+            <w:r>
+              <w:t xml:space="preserve">Пріоритет</w:t>
+            </w:r>
+          </w:p>
+        </w:tc>
+      </w:tr>
+      <w:tr>
+        <w:trPr>
+          <w:cantSplit/>
+        </w:trPr>
+        <w:tc>
+          <w:tcPr/>
+          <w:p>
+            <w:pPr>
+              <w:pStyle w:val="Compact"/>
+              <w:keepNext/>
+              <w:jc w:val="left"/>
+            </w:pPr>
+            <w:r>
+              <w:t xml:space="preserve">9</w:t>
+            </w:r>
+          </w:p>
+        </w:tc>
+        <w:tc>
+          <w:tcPr/>
+          <w:p>
+            <w:pPr>
+              <w:pStyle w:val="Compact"/>
+              <w:keepNext/>
+              <w:jc w:val="left"/>
+            </w:pPr>
+            <w:r>
+              <w:t xml:space="preserve">Ірина</w:t>
+            </w:r>
+          </w:p>
+        </w:tc>
+        <w:tc>
+          <w:tcPr/>
+          <w:p>
+            <w:pPr>
+              <w:pStyle w:val="Compact"/>
+              <w:keepNext/>
+              <w:jc w:val="left"/>
+            </w:pPr>
+            <w:r>
+              <w:t xml:space="preserve">Emotional</w:t>
+            </w:r>
+          </w:p>
+        </w:tc>
+        <w:tc>
+          <w:tcPr/>
+          <w:p>
+            <w:pPr>
+              <w:pStyle w:val="Compact"/>
+              <w:keepNext/>
+              <w:jc w:val="left"/>
+            </w:pPr>
+            <w:r>
+              <w:t xml:space="preserve">Коли я пробую нову програму, я хочу з першого разу розуміти, що робити, щоб не почуватися відсталою і не просити допомоги в сина</w:t>
+            </w:r>
+          </w:p>
+        </w:tc>
+        <w:tc>
+          <w:tcPr/>
+          <w:p>
+            <w:pPr>
+              <w:pStyle w:val="Compact"/>
+              <w:keepNext/>
+              <w:jc w:val="left"/>
+            </w:pPr>
+            <w:r>
+              <w:t xml:space="preserve">Med</w:t>
+            </w:r>
+          </w:p>
+        </w:tc>
+      </w:tr>
+      <w:tr>
+        <w:trPr>
+          <w:cantSplit/>
+        </w:trPr>
+        <w:tc>
+          <w:tcPr/>
+          <w:p>
+            <w:pPr>
+              <w:pStyle w:val="Compact"/>
+              <w:jc w:val="left"/>
+            </w:pPr>
+            <w:r>
+              <w:t xml:space="preserve">10</w:t>
+            </w:r>
+          </w:p>
+        </w:tc>
+        <w:tc>
+          <w:tcPr/>
+          <w:p>
+            <w:pPr>
+              <w:pStyle w:val="Compact"/>
+              <w:jc w:val="left"/>
+            </w:pPr>
+            <w:r>
+              <w:t xml:space="preserve">Ірина</w:t>
+            </w:r>
+          </w:p>
+        </w:tc>
+        <w:tc>
+          <w:tcPr/>
+          <w:p>
+            <w:pPr>
+              <w:pStyle w:val="Compact"/>
+              <w:jc w:val="left"/>
+            </w:pPr>
+            <w:r>
+              <w:t xml:space="preserve">Social</w:t>
+            </w:r>
+          </w:p>
+        </w:tc>
+        <w:tc>
+          <w:tcPr/>
+          <w:p>
+            <w:pPr>
+              <w:pStyle w:val="Compact"/>
+              <w:jc w:val="left"/>
+            </w:pPr>
+            <w:r>
+              <w:t xml:space="preserve">Коли батьки обирають репетитора для дитини, я хочу виглядати сучасною і надійною викладачкою, щоб вони залишались зі мною і рекомендували мене знайомим</w:t>
+            </w:r>
+          </w:p>
+        </w:tc>
+        <w:tc>
+          <w:tcPr/>
+          <w:p>
+            <w:pPr>
+              <w:pStyle w:val="Compact"/>
+              <w:jc w:val="left"/>
+            </w:pPr>
+            <w:r>
+              <w:t xml:space="preserve">Low</w:t>
             </w:r>
           </w:p>
         </w:tc>
       </w:tr>
     </w:tbl>
+    <w:p>
+      <w:pPr>
+        <w:pStyle w:val="BodyText"/>
+        <w:spacing w:before="420"/>
+      </w:pPr>
+      <w:r>
+        <w:t xml:space="preserve">Функціональних jobs шість, емоційних і соціальних – по два. Найвищий пріоритет мають jobs, пов’язані з грошима: облік оплат (1, 6) і нагадування про борг (2), а також емоційна робота 4. Вона пояснює, чому облік боргів болить сильніше, ніж має боліти суто технічна задача: проблема не в підрахунку, а в незручності нагадувати.</w:t>
+      </w:r>
+    </w:p>
+    <w:bookmarkEnd w:id="14"/>
+    <w:bookmarkEnd w:id="15"/>
+    <w:bookmarkStart w:id="16" w:name="four-forces-analysis"/>
+    <w:p>
+      <w:pPr>
+        <w:pStyle w:val="Heading1"/>
+      </w:pPr>
+      <w:r>
+        <w:t xml:space="preserve">2. Four Forces Analysis</w:t>
+      </w:r>
+    </w:p>
+    <w:p>
+      <w:pPr>
+        <w:pStyle w:val="FirstParagraph"/>
+      </w:pPr>
+      <w:r>
+        <w:t xml:space="preserve">Для аналізу чотирьох сил [2] обрано три функціональні jobs, що покривають три найбільші кластери affinity map практичної роботи № 1: «Незручно нагадувати про гроші» (12 стікерів), «Облік розкиданий по інструментах» (11) і «Перенесення ламають розклад» (9).</w:t>
+      </w:r>
+    </w:p>
     <w:p>
       <w:pPr>
         <w:pStyle w:val="TableCaptionOwn"/>
         <w:keepNext/>
-        <w:spacing w:before="240"/>
-      </w:pPr>
-      <w:r>
-        <w:t xml:space="preserve">Таблиця 4 – Four Forces для Job № 6: «Звести оплати за тиждень без ручного перерахунку»</w:t>
+      </w:pPr>
+      <w:r>
+        <w:t xml:space="preserve">Таблиця 3 – Four Forces для Job № 2: «Отримати борг без особистого нагадування»</w:t>
       </w:r>
     </w:p>
     <w:tbl>
@@ -1766,8 +1656,8 @@
         <w:tblLook w:firstRow="1" w:lastRow="0" w:firstColumn="0" w:lastColumn="0" w:noHBand="0" w:noVBand="0" w:val="0020"/>
       </w:tblPr>
       <w:tblGrid>
-        <w:gridCol w:w="1742"/>
-        <w:gridCol w:w="6177"/>
+        <w:gridCol w:w="2138"/>
+        <w:gridCol w:w="5781"/>
       </w:tblGrid>
       <w:tr>
         <w:trPr>
@@ -1827,7 +1717,7 @@
               <w:jc w:val="left"/>
             </w:pPr>
             <w:r>
-              <w:t xml:space="preserve">1. «У неділю ввечері я сиджу з журналом і калькулятором, зводжу, хто що заплатив готівкою, а хто на картку» (Ірина). 2. «Я реально не пам’ятаю, хто скинув за минулий тиждень, доводиться гортати виписку в моно» (Аліна). 3. «Пакет на вісім занять я рахую в табличці вручну, і вже двічі помилявся на свою користь» (Максим). 4. Облік одночасно ведеться в 3–4 інструментах, і жоден не пов’язує заняття з оплатою</w:t>
+              <w:t xml:space="preserve">1. «Писати мамі учня, що вона винна за три заняття, – це для мене найгірше» (Аліна). 2. «У березні я помітила, що Даня не платив три тижні, тільки коли рахувала дохід за місяць» (Аліна). 3. «Незручно нагадувати давнім учням, вони ж уже як свої» (Ірина). 4. Аліна втрачає до 1–2 оплат на місяць, бо відкладає нагадування</w:t>
             </w:r>
           </w:p>
         </w:tc>
@@ -1858,7 +1748,7 @@
               <w:jc w:val="left"/>
             </w:pPr>
             <w:r>
-              <w:t xml:space="preserve">«Щоб воно саме рахувало, а я тільки ставила галочку, що заплатили» (Ірина). Вечір неділі вільний, підсумок тижня готовий без калькулятора</w:t>
+              <w:t xml:space="preserve">Нагадування, що приходять «не від мене»: репетитор лише бачить, що борг погашено. Уявне краще майбутнє – «мені навіть не треба нагадувати про гроші самій»</w:t>
             </w:r>
           </w:p>
         </w:tc>
@@ -1889,7 +1779,7 @@
               <w:jc w:val="left"/>
             </w:pPr>
             <w:r>
-              <w:t xml:space="preserve">1. «Що як телефон сяде, коли нема світла, і я не побачу, хто коли приходить» (Ірина). 2. «Боюсь, що вб’ю вечір на те, щоб усіх занести, а потім закину» (Аліна). 3. Готівку, отриману від дитини, легко забути внести одразу</w:t>
+              <w:t xml:space="preserve">1. «Якщо бот напише мамі якось не так, вийде ще гірше, ніж коли пишу я» (Аліна). 2. Страх, що автоматичне нагадування виглядатиме як недовіра до давніх учнів. 3. Учні можуть ігнорувати повідомлення бота</w:t>
             </w:r>
           </w:p>
         </w:tc>
@@ -1920,7 +1810,7 @@
               <w:jc w:val="left"/>
             </w:pPr>
             <w:r>
-              <w:t xml:space="preserve">«Паперовий журнал я веду двадцять років, він ніколи не зависає» (Ірина). Excel і нотатки безкоштовні й знайомі, переходити ні на що не треба</w:t>
+              <w:t xml:space="preserve">Повідомлення в Telegram пишеться за хвилину і «так роблять усі». Частину боргів закривають самі учні, тому здається, що система й так працює</w:t>
             </w:r>
           </w:p>
         </w:tc>
@@ -1949,7 +1839,7 @@
               <w:jc w:val="left"/>
             </w:pPr>
             <w:r>
-              <w:t xml:space="preserve">Push: оплата відмічається одним дотиком біля заняття, борг рахується сам. Pull: щонеділі приходить готовий підсумок тижня по кожному учню. Anxiety: дані зберігаються локально й синхронізуються, щойно з’являється зв’язок; учнів можна імпортувати з календаря чи таблиці за кілька хвилин. Habit: екран обліку схожий на звичний журнал – рядок на учня, клітинка на заняття</w:t>
+              <w:t xml:space="preserve">Push: показувати борг автоматично, щойно заняття відбулось, а не наприкінці місяця. Pull: нагадування надходить від імені Classno, репетитор його не пише. Anxiety: репетитор бачить і редагує текст нагадування перед першим надсиланням, тон за замовчуванням ввічливий і нейтральний. Habit: нагадування приходить у звичний учням Telegram, а не в новий застосунок</w:t>
             </w:r>
           </w:p>
         </w:tc>
@@ -1959,10 +1849,10 @@
       <w:pPr>
         <w:pStyle w:val="TableCaptionOwn"/>
         <w:keepNext/>
-        <w:spacing w:before="240"/>
-      </w:pPr>
-      <w:r>
-        <w:t xml:space="preserve">Таблиця 5 – Four Forces для Job № 3: «Не втратити дохід через перенесення»</w:t>
+        <w:spacing w:before="420"/>
+      </w:pPr>
+      <w:r>
+        <w:t xml:space="preserve">Таблиця 4 – Four Forces для Job № 6: «Звести оплати за тиждень без ручного перерахунку»</w:t>
       </w:r>
     </w:p>
     <w:tbl>
@@ -1973,8 +1863,8 @@
         <w:tblLook w:firstRow="1" w:lastRow="0" w:firstColumn="0" w:lastColumn="0" w:noHBand="0" w:noVBand="0" w:val="0020"/>
       </w:tblPr>
       <w:tblGrid>
-        <w:gridCol w:w="1742"/>
-        <w:gridCol w:w="6177"/>
+        <w:gridCol w:w="2138"/>
+        <w:gridCol w:w="5781"/>
       </w:tblGrid>
       <w:tr>
         <w:trPr>
@@ -2034,6 +1924,213 @@
               <w:jc w:val="left"/>
             </w:pPr>
             <w:r>
+              <w:t xml:space="preserve">1. «У неділю ввечері я сиджу з журналом і калькулятором, зводжу, хто що заплатив готівкою, а хто на картку» (Ірина). 2. «Я реально не пам’ятаю, хто скинув за минулий тиждень, доводиться гортати виписку в моно» (Аліна). 3. «Пакет на вісім занять я рахую в табличці вручну, і вже двічі помилявся на свою користь» (Максим). 4. Облік одночасно ведеться в 3–4 інструментах, і жоден не пов’язує заняття з оплатою</w:t>
+            </w:r>
+          </w:p>
+        </w:tc>
+      </w:tr>
+      <w:tr>
+        <w:trPr>
+          <w:cantSplit/>
+        </w:trPr>
+        <w:tc>
+          <w:tcPr/>
+          <w:p>
+            <w:pPr>
+              <w:pStyle w:val="Compact"/>
+              <w:keepNext/>
+              <w:jc w:val="left"/>
+            </w:pPr>
+            <w:r>
+              <w:t xml:space="preserve">Pull</w:t>
+            </w:r>
+          </w:p>
+        </w:tc>
+        <w:tc>
+          <w:tcPr/>
+          <w:p>
+            <w:pPr>
+              <w:pStyle w:val="Compact"/>
+              <w:keepNext/>
+              <w:jc w:val="left"/>
+            </w:pPr>
+            <w:r>
+              <w:t xml:space="preserve">«Щоб воно саме рахувало, а я тільки ставила галочку, що заплатили» (Ірина). Вечір неділі вільний, підсумок тижня готовий без калькулятора</w:t>
+            </w:r>
+          </w:p>
+        </w:tc>
+      </w:tr>
+      <w:tr>
+        <w:trPr>
+          <w:cantSplit/>
+        </w:trPr>
+        <w:tc>
+          <w:tcPr/>
+          <w:p>
+            <w:pPr>
+              <w:pStyle w:val="Compact"/>
+              <w:keepNext/>
+              <w:jc w:val="left"/>
+            </w:pPr>
+            <w:r>
+              <w:t xml:space="preserve">Anxiety</w:t>
+            </w:r>
+          </w:p>
+        </w:tc>
+        <w:tc>
+          <w:tcPr/>
+          <w:p>
+            <w:pPr>
+              <w:pStyle w:val="Compact"/>
+              <w:keepNext/>
+              <w:jc w:val="left"/>
+            </w:pPr>
+            <w:r>
+              <w:t xml:space="preserve">1. «Що як телефон сяде, коли нема світла, і я не побачу, хто коли приходить» (Ірина). 2. «Боюсь, що вб’ю вечір на те, щоб усіх занести, а потім закину» (Аліна). 3. Готівку, отриману від дитини, легко забути внести одразу</w:t>
+            </w:r>
+          </w:p>
+        </w:tc>
+      </w:tr>
+      <w:tr>
+        <w:trPr>
+          <w:cantSplit/>
+        </w:trPr>
+        <w:tc>
+          <w:tcPr/>
+          <w:p>
+            <w:pPr>
+              <w:pStyle w:val="Compact"/>
+              <w:keepNext/>
+              <w:jc w:val="left"/>
+            </w:pPr>
+            <w:r>
+              <w:t xml:space="preserve">Habit</w:t>
+            </w:r>
+          </w:p>
+        </w:tc>
+        <w:tc>
+          <w:tcPr/>
+          <w:p>
+            <w:pPr>
+              <w:pStyle w:val="Compact"/>
+              <w:keepNext/>
+              <w:jc w:val="left"/>
+            </w:pPr>
+            <w:r>
+              <w:t xml:space="preserve">«Паперовий журнал я веду двадцять років, він ніколи не зависає» (Ірина). Excel і нотатки безкоштовні й знайомі, переходити ні на що не треба</w:t>
+            </w:r>
+          </w:p>
+        </w:tc>
+      </w:tr>
+      <w:tr>
+        <w:trPr>
+          <w:cantSplit/>
+        </w:trPr>
+        <w:tc>
+          <w:tcPr/>
+          <w:p>
+            <w:pPr>
+              <w:pStyle w:val="Compact"/>
+              <w:jc w:val="left"/>
+            </w:pPr>
+            <w:r>
+              <w:t xml:space="preserve">Продуктовий висновок</w:t>
+            </w:r>
+          </w:p>
+        </w:tc>
+        <w:tc>
+          <w:tcPr/>
+          <w:p>
+            <w:pPr>
+              <w:pStyle w:val="Compact"/>
+              <w:jc w:val="left"/>
+            </w:pPr>
+            <w:r>
+              <w:t xml:space="preserve">Push: оплата відмічається одним дотиком біля заняття, борг рахується сам. Pull: щонеділі приходить готовий підсумок тижня по кожному учню. Anxiety: дані зберігаються локально й синхронізуються, щойно з’являється зв’язок; учнів можна імпортувати з календаря чи таблиці за кілька хвилин. Habit: екран обліку схожий на звичний журнал – рядок на учня, клітинка на заняття</w:t>
+            </w:r>
+          </w:p>
+        </w:tc>
+      </w:tr>
+    </w:tbl>
+    <w:p>
+      <w:pPr>
+        <w:pStyle w:val="TableCaptionOwn"/>
+        <w:keepNext/>
+        <w:spacing w:before="420"/>
+      </w:pPr>
+      <w:r>
+        <w:t xml:space="preserve">Таблиця 5 – Four Forces для Job № 3: «Не втратити дохід через перенесення»</w:t>
+      </w:r>
+    </w:p>
+    <w:tbl>
+      <w:tblPr>
+        <w:tblStyle w:val="Table"/>
+        <w:tblW w:type="pct" w:w="5000"/>
+        <w:tblLayout w:type="fixed"/>
+        <w:tblLook w:firstRow="1" w:lastRow="0" w:firstColumn="0" w:lastColumn="0" w:noHBand="0" w:noVBand="0" w:val="0020"/>
+      </w:tblPr>
+      <w:tblGrid>
+        <w:gridCol w:w="2296"/>
+        <w:gridCol w:w="5623"/>
+      </w:tblGrid>
+      <w:tr>
+        <w:trPr>
+          <w:cantSplit/>
+          <w:tblHeader w:val="on"/>
+        </w:trPr>
+        <w:tc>
+          <w:tcPr/>
+          <w:p>
+            <w:pPr>
+              <w:pStyle w:val="Compact"/>
+              <w:keepNext/>
+              <w:jc w:val="center"/>
+            </w:pPr>
+            <w:r>
+              <w:t xml:space="preserve">Поле</w:t>
+            </w:r>
+          </w:p>
+        </w:tc>
+        <w:tc>
+          <w:tcPr/>
+          <w:p>
+            <w:pPr>
+              <w:pStyle w:val="Compact"/>
+              <w:keepNext/>
+              <w:jc w:val="center"/>
+            </w:pPr>
+            <w:r>
+              <w:t xml:space="preserve">Зміст</w:t>
+            </w:r>
+          </w:p>
+        </w:tc>
+      </w:tr>
+      <w:tr>
+        <w:trPr>
+          <w:cantSplit/>
+        </w:trPr>
+        <w:tc>
+          <w:tcPr/>
+          <w:p>
+            <w:pPr>
+              <w:pStyle w:val="Compact"/>
+              <w:keepNext/>
+              <w:jc w:val="left"/>
+            </w:pPr>
+            <w:r>
+              <w:t xml:space="preserve">Push</w:t>
+            </w:r>
+          </w:p>
+        </w:tc>
+        <w:tc>
+          <w:tcPr/>
+          <w:p>
+            <w:pPr>
+              <w:pStyle w:val="Compact"/>
+              <w:keepNext/>
+              <w:jc w:val="left"/>
+            </w:pPr>
+            <w:r>
               <w:t xml:space="preserve">1. «Перенос за годину до заняття – і в мене дірка в розкладі, яку вже ніхто не займе» (Аліна). 2. «Коли вимикають світло, половина розкладу летить, і я все переписую заново» (Ірина). 3. «Діти приходять не в той день, бо батьки переплутали» (Олена)</w:t>
             </w:r>
           </w:p>
@@ -2165,7 +2262,7 @@
     <w:p>
       <w:pPr>
         <w:pStyle w:val="BodyText"/>
-        <w:spacing w:before="240"/>
+        <w:spacing w:before="420"/>
       </w:pPr>
       <w:r>
         <w:t xml:space="preserve">Чотири сили показують, що перехід на Classno гальмує не функціональна, а емоційна складова: страх зіпсувати стосунки з учнями й страх змарнувати вечір на налаштування. Тому продукт має знімати Anxiety так само цілеспрямовано, як закривати Push.</w:t>
@@ -2186,7 +2283,7 @@
         <w:pStyle w:val="FirstParagraph"/>
       </w:pPr>
       <w:r>
-        <w:t xml:space="preserve">Канвас побудовано на дошці FigJam [16] за шаблоном Strategyzer [5], [6] у порядку, який задає методика: спершу Customer Profile (Jobs, потім Pains, потім Gains), потім Value Map. Кожен елемент має код: J – job, P – pain, G – gain, PS – продукт чи послуга, PR – pain reliever, GC – gain creator. Код у дужках після pain reliever чи gain creator показує, який pain або gain він закриває, і замінює стрілки на рисунку. Зірочкою позначено критичні jobs, де наявні рішення найслабші.</w:t>
+        <w:t xml:space="preserve">Канвас [3] побудовано у FigJam: праворуч Customer Profile, ліворуч Value Map. Кожен елемент має код: J – job, P – pain, G – gain, PS – продукт чи послуга, PR – pain reliever, GC – gain creator. Стрілки на рисунку і колонки «Закриває» та «Створює» в таблицях показують, який pain або gain закриває кожен елемент карти цінності. Зірочкою позначено критичні jobs, де наявні рішення найслабші.</w:t>
       </w:r>
     </w:p>
     <w:p>
@@ -2271,8 +2368,8 @@
         <w:tblLook w:firstRow="1" w:lastRow="0" w:firstColumn="0" w:lastColumn="0" w:noHBand="0" w:noVBand="0" w:val="0020"/>
       </w:tblPr>
       <w:tblGrid>
-        <w:gridCol w:w="1425"/>
-        <w:gridCol w:w="6494"/>
+        <w:gridCol w:w="2376"/>
+        <w:gridCol w:w="5544"/>
       </w:tblGrid>
       <w:tr>
         <w:trPr>
@@ -2433,7 +2530,7 @@
       <w:pPr>
         <w:pStyle w:val="TableCaptionOwn"/>
         <w:keepNext/>
-        <w:spacing w:before="240"/>
+        <w:spacing w:before="420"/>
       </w:pPr>
       <w:r>
         <w:t xml:space="preserve">Таблиця 7 – Pains: Аліна</w:t>
@@ -2447,8 +2544,8 @@
         <w:tblLook w:firstRow="1" w:lastRow="0" w:firstColumn="0" w:lastColumn="0" w:noHBand="0" w:noVBand="0" w:val="0020"/>
       </w:tblPr>
       <w:tblGrid>
-        <w:gridCol w:w="1425"/>
-        <w:gridCol w:w="6494"/>
+        <w:gridCol w:w="2138"/>
+        <w:gridCol w:w="5781"/>
       </w:tblGrid>
       <w:tr>
         <w:trPr>
@@ -2578,7 +2675,7 @@
       <w:pPr>
         <w:pStyle w:val="TableCaptionOwn"/>
         <w:keepNext/>
-        <w:spacing w:before="240"/>
+        <w:spacing w:before="420"/>
       </w:pPr>
       <w:r>
         <w:t xml:space="preserve">Таблиця 8 – Gains: Аліна</w:t>
@@ -2592,8 +2689,8 @@
         <w:tblLook w:firstRow="1" w:lastRow="0" w:firstColumn="0" w:lastColumn="0" w:noHBand="0" w:noVBand="0" w:val="0020"/>
       </w:tblPr>
       <w:tblGrid>
-        <w:gridCol w:w="1425"/>
-        <w:gridCol w:w="6494"/>
+        <w:gridCol w:w="2455"/>
+        <w:gridCol w:w="5464"/>
       </w:tblGrid>
       <w:tr>
         <w:trPr>
@@ -2755,6 +2852,7 @@
     <w:p>
       <w:pPr>
         <w:pStyle w:val="Heading2"/>
+        <w:spacing w:before="420"/>
       </w:pPr>
       <w:r>
         <w:t xml:space="preserve">3.2. Value Map</w:t>
@@ -2777,8 +2875,8 @@
         <w:tblLook w:firstRow="1" w:lastRow="0" w:firstColumn="0" w:lastColumn="0" w:noHBand="0" w:noVBand="0" w:val="0020"/>
       </w:tblPr>
       <w:tblGrid>
-        <w:gridCol w:w="1425"/>
-        <w:gridCol w:w="6494"/>
+        <w:gridCol w:w="2217"/>
+        <w:gridCol w:w="5702"/>
       </w:tblGrid>
       <w:tr>
         <w:trPr>
@@ -2908,10 +3006,10 @@
       <w:pPr>
         <w:pStyle w:val="TableCaptionOwn"/>
         <w:keepNext/>
-        <w:spacing w:before="240"/>
-      </w:pPr>
-      <w:r>
-        <w:t xml:space="preserve">Таблиця 10 – Pain Relievers і Gain Creators: Аліна</w:t>
+        <w:spacing w:before="420"/>
+      </w:pPr>
+      <w:r>
+        <w:t xml:space="preserve">Таблиця 10 – Pain Relievers: Аліна</w:t>
       </w:r>
     </w:p>
     <w:tbl>
@@ -2922,10 +3020,10 @@
         <w:tblLook w:firstRow="1" w:lastRow="0" w:firstColumn="0" w:lastColumn="0" w:noHBand="0" w:noVBand="0" w:val="0020"/>
       </w:tblPr>
       <w:tblGrid>
-        <w:gridCol w:w="633"/>
-        <w:gridCol w:w="4910"/>
-        <w:gridCol w:w="950"/>
-        <w:gridCol w:w="1425"/>
+        <w:gridCol w:w="1019"/>
+        <w:gridCol w:w="3293"/>
+        <w:gridCol w:w="1568"/>
+        <w:gridCol w:w="2038"/>
       </w:tblGrid>
       <w:tr>
         <w:trPr>
@@ -3324,7 +3422,16 @@
         </w:tc>
       </w:tr>
     </w:tbl>
-    <w:p/>
+    <w:p>
+      <w:pPr>
+        <w:pStyle w:val="TableCaptionOwn"/>
+        <w:keepNext/>
+        <w:spacing w:before="420"/>
+      </w:pPr>
+      <w:r>
+        <w:t xml:space="preserve">Таблиця 11 – Gain Creators: Аліна</w:t>
+      </w:r>
+    </w:p>
     <w:tbl>
       <w:tblPr>
         <w:tblStyle w:val="Table"/>
@@ -3333,10 +3440,10 @@
         <w:tblLook w:firstRow="1" w:lastRow="0" w:firstColumn="0" w:lastColumn="0" w:noHBand="0" w:noVBand="0" w:val="0020"/>
       </w:tblPr>
       <w:tblGrid>
-        <w:gridCol w:w="633"/>
-        <w:gridCol w:w="4910"/>
-        <w:gridCol w:w="950"/>
-        <w:gridCol w:w="1425"/>
+        <w:gridCol w:w="1029"/>
+        <w:gridCol w:w="3247"/>
+        <w:gridCol w:w="1504"/>
+        <w:gridCol w:w="2138"/>
       </w:tblGrid>
       <w:tr>
         <w:trPr>
@@ -3349,7 +3456,6 @@
             <w:pPr>
               <w:pStyle w:val="Compact"/>
               <w:keepNext/>
-              <w:spacing w:before="240"/>
               <w:jc w:val="center"/>
             </w:pPr>
             <w:r>
@@ -3798,6 +3904,7 @@
     <w:p>
       <w:pPr>
         <w:pStyle w:val="Heading2"/>
+        <w:spacing w:before="420"/>
       </w:pPr>
       <w:r>
         <w:t xml:space="preserve">3.3. Аналіз FIT</w:t>
@@ -3809,7 +3916,7 @@
         <w:keepNext/>
       </w:pPr>
       <w:r>
-        <w:t xml:space="preserve">Таблиця 11 – Покриття Customer Profile: Аліна</w:t>
+        <w:t xml:space="preserve">Таблиця 12 – Покриття Customer Profile: Аліна</w:t>
       </w:r>
     </w:p>
     <w:tbl>
@@ -3820,10 +3927,10 @@
         <w:tblLook w:firstRow="1" w:lastRow="0" w:firstColumn="0" w:lastColumn="0" w:noHBand="0" w:noVBand="0" w:val="0020"/>
       </w:tblPr>
       <w:tblGrid>
-        <w:gridCol w:w="2692"/>
-        <w:gridCol w:w="2059"/>
-        <w:gridCol w:w="1584"/>
-        <w:gridCol w:w="1584"/>
+        <w:gridCol w:w="2613"/>
+        <w:gridCol w:w="2138"/>
+        <w:gridCol w:w="1900"/>
+        <w:gridCol w:w="1267"/>
       </w:tblGrid>
       <w:tr>
         <w:trPr>
@@ -4168,7 +4275,7 @@
     <w:p>
       <w:pPr>
         <w:pStyle w:val="BodyText"/>
-        <w:spacing w:before="240"/>
+        <w:spacing w:before="420"/>
       </w:pPr>
       <w:r>
         <w:t xml:space="preserve">Gap Analysis. Без продуктового рішення лишаються:</w:t>
@@ -4308,7 +4415,7 @@
         <w:keepNext/>
       </w:pPr>
       <w:r>
-        <w:t xml:space="preserve">Таблиця 12 – Customer Jobs: Ірина</w:t>
+        <w:t xml:space="preserve">Таблиця 13 – Customer Jobs: Ірина</w:t>
       </w:r>
     </w:p>
     <w:tbl>
@@ -4319,8 +4426,8 @@
         <w:tblLook w:firstRow="1" w:lastRow="0" w:firstColumn="0" w:lastColumn="0" w:noHBand="0" w:noVBand="0" w:val="0020"/>
       </w:tblPr>
       <w:tblGrid>
-        <w:gridCol w:w="1425"/>
-        <w:gridCol w:w="6494"/>
+        <w:gridCol w:w="2296"/>
+        <w:gridCol w:w="5623"/>
       </w:tblGrid>
       <w:tr>
         <w:trPr>
@@ -4481,10 +4588,10 @@
       <w:pPr>
         <w:pStyle w:val="TableCaptionOwn"/>
         <w:keepNext/>
-        <w:spacing w:before="240"/>
-      </w:pPr>
-      <w:r>
-        <w:t xml:space="preserve">Таблиця 13 – Pains: Ірина</w:t>
+        <w:spacing w:before="420"/>
+      </w:pPr>
+      <w:r>
+        <w:t xml:space="preserve">Таблиця 14 – Pains: Ірина</w:t>
       </w:r>
     </w:p>
     <w:tbl>
@@ -4495,8 +4602,8 @@
         <w:tblLook w:firstRow="1" w:lastRow="0" w:firstColumn="0" w:lastColumn="0" w:noHBand="0" w:noVBand="0" w:val="0020"/>
       </w:tblPr>
       <w:tblGrid>
-        <w:gridCol w:w="1425"/>
-        <w:gridCol w:w="6494"/>
+        <w:gridCol w:w="2138"/>
+        <w:gridCol w:w="5781"/>
       </w:tblGrid>
       <w:tr>
         <w:trPr>
@@ -4616,7 +4723,7 @@
               <w:jc w:val="left"/>
             </w:pPr>
             <w:r>
-              <w:t xml:space="preserve">P5. «Я пробувала якусь програму для репетиторів, але там усе англійською і стільки кнопок, що я закрила її через десять хвилин» (фрустрація). P6. «Що як телефон сяде, коли нема світла, і я не побачу, хто коли приходить» (ризик)</w:t>
+              <w:t xml:space="preserve">P5. «Я пробувала якусь програму для репетиторів, але там… стільки кнопок, що я закрила її через десять хвилин» (фрустрація). P6. «Що як телефон сяде, коли нема світла, і я не побачу, хто коли приходить» (ризик)</w:t>
             </w:r>
           </w:p>
         </w:tc>
@@ -4626,10 +4733,10 @@
       <w:pPr>
         <w:pStyle w:val="TableCaptionOwn"/>
         <w:keepNext/>
-        <w:spacing w:before="240"/>
-      </w:pPr>
-      <w:r>
-        <w:t xml:space="preserve">Таблиця 14 – Gains: Ірина</w:t>
+        <w:spacing w:before="420"/>
+      </w:pPr>
+      <w:r>
+        <w:t xml:space="preserve">Таблиця 15 – Gains: Ірина</w:t>
       </w:r>
     </w:p>
     <w:tbl>
@@ -4640,8 +4747,8 @@
         <w:tblLook w:firstRow="1" w:lastRow="0" w:firstColumn="0" w:lastColumn="0" w:noHBand="0" w:noVBand="0" w:val="0020"/>
       </w:tblPr>
       <w:tblGrid>
-        <w:gridCol w:w="1425"/>
-        <w:gridCol w:w="6494"/>
+        <w:gridCol w:w="2376"/>
+        <w:gridCol w:w="5544"/>
       </w:tblGrid>
       <w:tr>
         <w:trPr>
@@ -4701,7 +4808,7 @@
               <w:jc w:val="left"/>
             </w:pPr>
             <w:r>
-              <w:t xml:space="preserve">G1. Точний облік готівки й переказів по кожному учню. G2. Повністю український інтерфейс без складних налаштувань</w:t>
+              <w:t xml:space="preserve">G1. Точний облік готівки й переказів по кожному учню. G2. Простий інтерфейс, з яким можна почати без налаштувань і сторонньої допомоги</w:t>
             </w:r>
           </w:p>
         </w:tc>
@@ -4803,6 +4910,7 @@
     <w:p>
       <w:pPr>
         <w:pStyle w:val="Heading2"/>
+        <w:spacing w:before="420"/>
       </w:pPr>
       <w:r>
         <w:t xml:space="preserve">4.2. Value Map</w:t>
@@ -4814,7 +4922,7 @@
         <w:keepNext/>
       </w:pPr>
       <w:r>
-        <w:t xml:space="preserve">Таблиця 15 – Products &amp; Services: Ірина</w:t>
+        <w:t xml:space="preserve">Таблиця 16 – Products &amp; Services: Ірина</w:t>
       </w:r>
     </w:p>
     <w:tbl>
@@ -4825,8 +4933,8 @@
         <w:tblLook w:firstRow="1" w:lastRow="0" w:firstColumn="0" w:lastColumn="0" w:noHBand="0" w:noVBand="0" w:val="0020"/>
       </w:tblPr>
       <w:tblGrid>
-        <w:gridCol w:w="1425"/>
-        <w:gridCol w:w="6494"/>
+        <w:gridCol w:w="2217"/>
+        <w:gridCol w:w="5702"/>
       </w:tblGrid>
       <w:tr>
         <w:trPr>
@@ -4946,7 +5054,7 @@
               <w:jc w:val="left"/>
             </w:pPr>
             <w:r>
-              <w:t xml:space="preserve">PS8. Онбординг українською на 3 кроки і відеоінструкція на 2 хв. PS9. Чат підтримки українською</w:t>
+              <w:t xml:space="preserve">PS8. Онбординг на 3 кроки і відеоінструкція на 2 хв. PS9. Чат підтримки</w:t>
             </w:r>
           </w:p>
         </w:tc>
@@ -4956,10 +5064,10 @@
       <w:pPr>
         <w:pStyle w:val="TableCaptionOwn"/>
         <w:keepNext/>
-        <w:spacing w:before="240"/>
-      </w:pPr>
-      <w:r>
-        <w:t xml:space="preserve">Таблиця 16 – Pain Relievers і Gain Creators: Ірина</w:t>
+        <w:spacing w:before="420"/>
+      </w:pPr>
+      <w:r>
+        <w:t xml:space="preserve">Таблиця 17 – Pain Relievers: Ірина</w:t>
       </w:r>
     </w:p>
     <w:tbl>
@@ -4970,10 +5078,10 @@
         <w:tblLook w:firstRow="1" w:lastRow="0" w:firstColumn="0" w:lastColumn="0" w:noHBand="0" w:noVBand="0" w:val="0020"/>
       </w:tblPr>
       <w:tblGrid>
-        <w:gridCol w:w="633"/>
-        <w:gridCol w:w="4910"/>
-        <w:gridCol w:w="950"/>
-        <w:gridCol w:w="1425"/>
+        <w:gridCol w:w="960"/>
+        <w:gridCol w:w="3440"/>
+        <w:gridCol w:w="1520"/>
+        <w:gridCol w:w="2000"/>
       </w:tblGrid>
       <w:tr>
         <w:trPr>
@@ -5287,7 +5395,7 @@
               <w:jc w:val="left"/>
             </w:pPr>
             <w:r>
-              <w:t xml:space="preserve">Простий інтерфейс українською: три основні екрани, онбординг на 3 кроки</w:t>
+              <w:t xml:space="preserve">Лише три основні екрани, жодних налаштувань перед стартом</w:t>
             </w:r>
           </w:p>
         </w:tc>
@@ -5372,7 +5480,16 @@
         </w:tc>
       </w:tr>
     </w:tbl>
-    <w:p/>
+    <w:p>
+      <w:pPr>
+        <w:pStyle w:val="TableCaptionOwn"/>
+        <w:keepNext/>
+        <w:spacing w:before="420"/>
+      </w:pPr>
+      <w:r>
+        <w:t xml:space="preserve">Таблиця 18 – Gain Creators: Ірина</w:t>
+      </w:r>
+    </w:p>
     <w:tbl>
       <w:tblPr>
         <w:tblStyle w:val="Table"/>
@@ -5381,10 +5498,10 @@
         <w:tblLook w:firstRow="1" w:lastRow="0" w:firstColumn="0" w:lastColumn="0" w:noHBand="0" w:noVBand="0" w:val="0020"/>
       </w:tblPr>
       <w:tblGrid>
-        <w:gridCol w:w="633"/>
-        <w:gridCol w:w="4910"/>
-        <w:gridCol w:w="950"/>
-        <w:gridCol w:w="1425"/>
+        <w:gridCol w:w="1029"/>
+        <w:gridCol w:w="3168"/>
+        <w:gridCol w:w="1584"/>
+        <w:gridCol w:w="2138"/>
       </w:tblGrid>
       <w:tr>
         <w:trPr>
@@ -5397,7 +5514,6 @@
             <w:pPr>
               <w:pStyle w:val="Compact"/>
               <w:keepNext/>
-              <w:spacing w:before="240"/>
               <w:jc w:val="center"/>
             </w:pPr>
             <w:r>
@@ -5528,7 +5644,7 @@
               <w:jc w:val="left"/>
             </w:pPr>
             <w:r>
-              <w:t xml:space="preserve">Інтерфейс і підтримка повністю українською</w:t>
+              <w:t xml:space="preserve">Покроковий онбординг і відеоінструкція на 2 хвилини</w:t>
             </w:r>
           </w:p>
         </w:tc>
@@ -5846,6 +5962,7 @@
     <w:p>
       <w:pPr>
         <w:pStyle w:val="Heading2"/>
+        <w:spacing w:before="420"/>
       </w:pPr>
       <w:r>
         <w:t xml:space="preserve">4.3. Аналіз FIT</w:t>
@@ -5857,7 +5974,7 @@
         <w:keepNext/>
       </w:pPr>
       <w:r>
-        <w:t xml:space="preserve">Таблиця 17 – Покриття Customer Profile: Ірина</w:t>
+        <w:t xml:space="preserve">Таблиця 19 – Покриття Customer Profile: Ірина</w:t>
       </w:r>
     </w:p>
     <w:tbl>
@@ -5868,10 +5985,10 @@
         <w:tblLook w:firstRow="1" w:lastRow="0" w:firstColumn="0" w:lastColumn="0" w:noHBand="0" w:noVBand="0" w:val="0020"/>
       </w:tblPr>
       <w:tblGrid>
-        <w:gridCol w:w="2692"/>
-        <w:gridCol w:w="2059"/>
-        <w:gridCol w:w="1584"/>
-        <w:gridCol w:w="1584"/>
+        <w:gridCol w:w="2613"/>
+        <w:gridCol w:w="2138"/>
+        <w:gridCol w:w="1900"/>
+        <w:gridCol w:w="1267"/>
       </w:tblGrid>
       <w:tr>
         <w:trPr>
@@ -6216,7 +6333,7 @@
     <w:p>
       <w:pPr>
         <w:pStyle w:val="BodyText"/>
-        <w:spacing w:before="240"/>
+        <w:spacing w:before="420"/>
       </w:pPr>
       <w:r>
         <w:t xml:space="preserve">Gap Analysis:</w:t>
@@ -6290,7 +6407,7 @@
         <w:pStyle w:val="FirstParagraph"/>
       </w:pPr>
       <w:r>
-        <w:t xml:space="preserve">Problem Statements сформульовано для трьох найкритичніших проблем за шаблоном «[ПЕРСОНА] потребує способу [ДІЯ], тому що [ПРИЧИНА]». Кожну перевірено за чек-листом методичних вказівок.</w:t>
+        <w:t xml:space="preserve">Problem Statements сформульовано для трьох найкритичніших проблем за шаблоном «[ПЕРСОНА] потребує способу [ДІЯ], тому що [ПРИЧИНА]». Кожне формулювання перевірено за п’ятьма критеріями.</w:t>
       </w:r>
     </w:p>
     <w:p>
@@ -6299,7 +6416,7 @@
         <w:keepNext/>
       </w:pPr>
       <w:r>
-        <w:t xml:space="preserve">Таблиця 18 – Перевірка Problem Statements за чек-листом</w:t>
+        <w:t xml:space="preserve">Таблиця 20 – Перевірка Problem Statements за чек-листом</w:t>
       </w:r>
     </w:p>
     <w:tbl>
@@ -6310,11 +6427,11 @@
         <w:tblLook w:firstRow="1" w:lastRow="0" w:firstColumn="0" w:lastColumn="0" w:noHBand="0" w:noVBand="0" w:val="0020"/>
       </w:tblPr>
       <w:tblGrid>
-        <w:gridCol w:w="1425"/>
-        <w:gridCol w:w="4118"/>
+        <w:gridCol w:w="1980"/>
+        <w:gridCol w:w="3405"/>
         <w:gridCol w:w="792"/>
-        <w:gridCol w:w="792"/>
-        <w:gridCol w:w="792"/>
+        <w:gridCol w:w="871"/>
+        <w:gridCol w:w="871"/>
       </w:tblGrid>
       <w:tr>
         <w:trPr>
@@ -6737,10 +6854,10 @@
       <w:pPr>
         <w:pStyle w:val="TableCaptionOwn"/>
         <w:keepNext/>
-        <w:spacing w:before="240"/>
-      </w:pPr>
-      <w:r>
-        <w:t xml:space="preserve">Таблиця 19 – Problem Statement № 1</w:t>
+        <w:spacing w:before="420"/>
+      </w:pPr>
+      <w:r>
+        <w:t xml:space="preserve">Таблиця 21 – Problem Statement № 1</w:t>
       </w:r>
     </w:p>
     <w:tbl>
@@ -6751,8 +6868,8 @@
         <w:tblLook w:firstRow="1" w:lastRow="0" w:firstColumn="0" w:lastColumn="0" w:noHBand="0" w:noVBand="0" w:val="0020"/>
       </w:tblPr>
       <w:tblGrid>
-        <w:gridCol w:w="1742"/>
-        <w:gridCol w:w="6177"/>
+        <w:gridCol w:w="2455"/>
+        <w:gridCol w:w="5464"/>
       </w:tblGrid>
       <w:tr>
         <w:trPr>
@@ -6975,10 +7092,10 @@
       <w:pPr>
         <w:pStyle w:val="TableCaptionOwn"/>
         <w:keepNext/>
-        <w:spacing w:before="240"/>
-      </w:pPr>
-      <w:r>
-        <w:t xml:space="preserve">Таблиця 20 – Problem Statement № 2</w:t>
+        <w:spacing w:before="420"/>
+      </w:pPr>
+      <w:r>
+        <w:t xml:space="preserve">Таблиця 22 – Problem Statement № 2</w:t>
       </w:r>
     </w:p>
     <w:tbl>
@@ -6989,8 +7106,8 @@
         <w:tblLook w:firstRow="1" w:lastRow="0" w:firstColumn="0" w:lastColumn="0" w:noHBand="0" w:noVBand="0" w:val="0020"/>
       </w:tblPr>
       <w:tblGrid>
-        <w:gridCol w:w="1742"/>
-        <w:gridCol w:w="6177"/>
+        <w:gridCol w:w="2613"/>
+        <w:gridCol w:w="5306"/>
       </w:tblGrid>
       <w:tr>
         <w:trPr>
@@ -7213,10 +7330,10 @@
       <w:pPr>
         <w:pStyle w:val="TableCaptionOwn"/>
         <w:keepNext/>
-        <w:spacing w:before="240"/>
-      </w:pPr>
-      <w:r>
-        <w:t xml:space="preserve">Таблиця 21 – Problem Statement № 3</w:t>
+        <w:spacing w:before="420"/>
+      </w:pPr>
+      <w:r>
+        <w:t xml:space="preserve">Таблиця 23 – Problem Statement № 3</w:t>
       </w:r>
     </w:p>
     <w:tbl>
@@ -7227,8 +7344,8 @@
         <w:tblLook w:firstRow="1" w:lastRow="0" w:firstColumn="0" w:lastColumn="0" w:noHBand="0" w:noVBand="0" w:val="0020"/>
       </w:tblPr>
       <w:tblGrid>
-        <w:gridCol w:w="1742"/>
-        <w:gridCol w:w="6177"/>
+        <w:gridCol w:w="2613"/>
+        <w:gridCol w:w="5306"/>
       </w:tblGrid>
       <w:tr>
         <w:trPr>
@@ -7450,7 +7567,7 @@
     <w:p>
       <w:pPr>
         <w:pStyle w:val="BodyText"/>
-        <w:spacing w:before="240"/>
+        <w:spacing w:before="420"/>
       </w:pPr>
       <w:r>
         <w:t xml:space="preserve">Вимірність кожного формулювання: для PS1 – кількість неотриманих або прострочених оплат на місяць, для PS2 – час на тижневе зведення оплат, для PS3 – час на перенесення і частка звільнених слотів, які вдалося заповнити.</w:t>
@@ -7471,7 +7588,7 @@
         <w:pStyle w:val="FirstParagraph"/>
       </w:pPr>
       <w:r>
-        <w:t xml:space="preserve">Для кожного Problem Statement запропоновано три рішення й оцінено за трьома лінзами IDEO [7] за шкалою 1–5 відповідно до критеріїв методичних вказівок.</w:t>
+        <w:t xml:space="preserve">Для кожного Problem Statement запропоновано три рішення й оцінено за трьома лінзами IDEO [4] за шкалою від 1 до 5.</w:t>
       </w:r>
     </w:p>
     <w:p>
@@ -7480,7 +7597,7 @@
         <w:keepNext/>
       </w:pPr>
       <w:r>
-        <w:t xml:space="preserve">Таблиця 22 – Матриця Desirability / Viability / Feasibility</w:t>
+        <w:t xml:space="preserve">Таблиця 24 – Матриця Desirability / Viability / Feasibility</w:t>
       </w:r>
     </w:p>
     <w:tbl>
@@ -7491,13 +7608,13 @@
         <w:tblLook w:firstRow="1" w:lastRow="0" w:firstColumn="0" w:lastColumn="0" w:noHBand="0" w:noVBand="0" w:val="0020"/>
       </w:tblPr>
       <w:tblGrid>
-        <w:gridCol w:w="791"/>
-        <w:gridCol w:w="3643"/>
-        <w:gridCol w:w="554"/>
-        <w:gridCol w:w="554"/>
-        <w:gridCol w:w="554"/>
-        <w:gridCol w:w="712"/>
-        <w:gridCol w:w="1108"/>
+        <w:gridCol w:w="1267"/>
+        <w:gridCol w:w="2376"/>
+        <w:gridCol w:w="475"/>
+        <w:gridCol w:w="475"/>
+        <w:gridCol w:w="475"/>
+        <w:gridCol w:w="950"/>
+        <w:gridCol w:w="1900"/>
       </w:tblGrid>
       <w:tr>
         <w:trPr>
@@ -8457,7 +8574,7 @@
     <w:p>
       <w:pPr>
         <w:pStyle w:val="BodyText"/>
-        <w:spacing w:before="240"/>
+        <w:spacing w:before="420"/>
       </w:pPr>
       <w:r>
         <w:t xml:space="preserve">Обґрунтування оцінок. Desirability 5 отримали лише рішення 1A і 1B: їх прямо підтверджують цитати всіх п’яти учасників інтерв’ю і 61% опитаних. Viability для рішень обліку й нагадувань – 4, бо саме вони визначають ліміт безкоштовного тарифу і перехід на Pro, а аналоги (TutorBird, My Music Staff) заробляють саме на білінгу й нагадуваннях. Feasibility 2 у рішень 1C і 3C пов’язана з банківською інтеграцією та алгоритмом підбору, які не вкладаються у 2–4 тижні розробки. Голосове введення відхилено: жоден учасник досліджень не просив такої функції, тож Desirability – здогадка.</w:t>
@@ -8613,7 +8730,7 @@
         <w:pStyle w:val="FirstParagraph"/>
       </w:pPr>
       <w:r>
-        <w:t xml:space="preserve">Головні меседжі прямих конкурентів з практичної роботи № 1 взято з їхніх сайтів і сторінки в Google Play, цитати наведено дослівно.</w:t>
+        <w:t xml:space="preserve">Головні меседжі прямих конкурентів з практичної роботи № 1 взято з їхніх сайтів і сторінки в Google Play [8]–[11], цитати наведено дослівно.</w:t>
       </w:r>
     </w:p>
     <w:p>
@@ -8622,7 +8739,7 @@
         <w:keepNext/>
       </w:pPr>
       <w:r>
-        <w:t xml:space="preserve">Таблиця 23 – UVP конкурентів</w:t>
+        <w:t xml:space="preserve">Таблиця 25 – UVP конкурентів</w:t>
       </w:r>
     </w:p>
     <w:tbl>
@@ -8633,11 +8750,11 @@
         <w:tblLook w:firstRow="1" w:lastRow="0" w:firstColumn="0" w:lastColumn="0" w:noHBand="0" w:noVBand="0" w:val="0020"/>
       </w:tblPr>
       <w:tblGrid>
-        <w:gridCol w:w="1108"/>
-        <w:gridCol w:w="2059"/>
-        <w:gridCol w:w="1425"/>
-        <w:gridCol w:w="1584"/>
-        <w:gridCol w:w="1742"/>
+        <w:gridCol w:w="1360"/>
+        <w:gridCol w:w="1600"/>
+        <w:gridCol w:w="1520"/>
+        <w:gridCol w:w="1680"/>
+        <w:gridCol w:w="1760"/>
       </w:tblGrid>
       <w:tr>
         <w:trPr>
@@ -8723,7 +8840,7 @@
               <w:jc w:val="left"/>
             </w:pPr>
             <w:r>
-              <w:t xml:space="preserve">TutorBird [11]</w:t>
+              <w:t xml:space="preserve">TutorBird</w:t>
             </w:r>
           </w:p>
         </w:tc>
@@ -8793,7 +8910,7 @@
               <w:jc w:val="left"/>
             </w:pPr>
             <w:r>
-              <w:t xml:space="preserve">Teachworks [12]</w:t>
+              <w:t xml:space="preserve">Teachworks</w:t>
             </w:r>
           </w:p>
         </w:tc>
@@ -8819,20 +8936,20 @@
               <w:jc w:val="left"/>
             </w:pPr>
             <w:r>
-              <w:t xml:space="preserve">Агенції з кількома викладачами, музичні, мовні, автошколи</w:t>
-            </w:r>
-          </w:p>
-        </w:tc>
-        <w:tc>
-          <w:tcPr/>
-          <w:p>
-            <w:pPr>
-              <w:pStyle w:val="Compact"/>
-              <w:keepNext/>
-              <w:jc w:val="left"/>
-            </w:pPr>
-            <w:r>
-              <w:t xml:space="preserve">Автоматизувати білінг, персонал і зарплати, щоб масштабуватись</w:t>
+              <w:t xml:space="preserve">Агенції та школи з кількома викладачами: музичні, мовні, автошколи</w:t>
+            </w:r>
+          </w:p>
+        </w:tc>
+        <w:tc>
+          <w:tcPr/>
+          <w:p>
+            <w:pPr>
+              <w:pStyle w:val="Compact"/>
+              <w:keepNext/>
+              <w:jc w:val="left"/>
+            </w:pPr>
+            <w:r>
+              <w:t xml:space="preserve">Автоматичні рахунки, облік персоналу й зарплат для зростання бізнесу</w:t>
             </w:r>
           </w:p>
         </w:tc>
@@ -8863,7 +8980,7 @@
               <w:jc w:val="left"/>
             </w:pPr>
             <w:r>
-              <w:t xml:space="preserve">My Music Staff [13]</w:t>
+              <w:t xml:space="preserve">My Music Staff</w:t>
             </w:r>
           </w:p>
         </w:tc>
@@ -8932,31 +9049,31 @@
               <w:jc w:val="left"/>
             </w:pPr>
             <w:r>
-              <w:t xml:space="preserve">ЯРепетитор [14]</w:t>
-            </w:r>
-          </w:p>
-        </w:tc>
-        <w:tc>
-          <w:tcPr/>
-          <w:p>
-            <w:pPr>
-              <w:pStyle w:val="Compact"/>
-              <w:jc w:val="left"/>
-            </w:pPr>
-            <w:r>
-              <w:t xml:space="preserve">«Помічник репетитора: керівництво учнями, календар занять, розрахунки, звіти». «Більше не потрібно вести щоденники та використовувати електронні таблиці»</w:t>
-            </w:r>
-          </w:p>
-        </w:tc>
-        <w:tc>
-          <w:tcPr/>
-          <w:p>
-            <w:pPr>
-              <w:pStyle w:val="Compact"/>
-              <w:jc w:val="left"/>
-            </w:pPr>
-            <w:r>
-              <w:t xml:space="preserve">Індивідуальні репетитори</w:t>
+              <w:t xml:space="preserve">ЯРепетитор</w:t>
+            </w:r>
+          </w:p>
+        </w:tc>
+        <w:tc>
+          <w:tcPr/>
+          <w:p>
+            <w:pPr>
+              <w:pStyle w:val="Compact"/>
+              <w:jc w:val="left"/>
+            </w:pPr>
+            <w:r>
+              <w:t xml:space="preserve">«Помічник репетитора: керівництво учнями, календар занять, розрахунки, звіти»</w:t>
+            </w:r>
+          </w:p>
+        </w:tc>
+        <w:tc>
+          <w:tcPr/>
+          <w:p>
+            <w:pPr>
+              <w:pStyle w:val="Compact"/>
+              <w:jc w:val="left"/>
+            </w:pPr>
+            <w:r>
+              <w:t xml:space="preserve">Репетитори, які працюють самі</w:t>
             </w:r>
           </w:p>
         </w:tc>
@@ -8989,10 +9106,10 @@
     <w:p>
       <w:pPr>
         <w:pStyle w:val="BodyText"/>
-        <w:spacing w:before="240"/>
-      </w:pPr>
-      <w:r>
-        <w:t xml:space="preserve">TutorBird і My Music Staff випускає одна канадська компанія, і їхні сайти побудовано за одним шаблоном. TutorCruncher [15] позиціонується так само, як Teachworks: «The most comprehensive software for tutoring businesses».</w:t>
+        <w:spacing w:before="420"/>
+      </w:pPr>
+      <w:r>
+        <w:t xml:space="preserve">TutorBird і My Music Staff випускає одна канадська компанія, і їхні сайти побудовано за одним шаблоном. TutorCruncher [12] позиціонується так само, як Teachworks: «The most comprehensive software for tutoring businesses».</w:t>
       </w:r>
     </w:p>
     <w:p>
@@ -9018,7 +9135,7 @@
         <w:pStyle w:val="FirstParagraph"/>
       </w:pPr>
       <w:r>
-        <w:t xml:space="preserve">UVP сформульовано у двох форматах для кожної персони: за шаблоном Джеффрі Мура [8] і за формулою Стіва Бланка [9]. Ключові слова взято з інтерв’ю.</w:t>
+        <w:t xml:space="preserve">UVP сформульовано у двох форматах для кожної персони: за шаблоном Джеффрі Мура [5] і за формулою Стіва Бланка [6]. Ключові слова взято з інтерв’ю.</w:t>
       </w:r>
     </w:p>
     <w:p>
@@ -9027,7 +9144,7 @@
         <w:keepNext/>
       </w:pPr>
       <w:r>
-        <w:t xml:space="preserve">Таблиця 24 – UVP для персони Аліна</w:t>
+        <w:t xml:space="preserve">Таблиця 26 – UVP для персони Аліна</w:t>
       </w:r>
     </w:p>
     <w:tbl>
@@ -9038,8 +9155,8 @@
         <w:tblLook w:firstRow="1" w:lastRow="0" w:firstColumn="0" w:lastColumn="0" w:noHBand="0" w:noVBand="0" w:val="0020"/>
       </w:tblPr>
       <w:tblGrid>
-        <w:gridCol w:w="1742"/>
-        <w:gridCol w:w="6177"/>
+        <w:gridCol w:w="2296"/>
+        <w:gridCol w:w="5623"/>
       </w:tblGrid>
       <w:tr>
         <w:trPr>
@@ -9200,10 +9317,10 @@
       <w:pPr>
         <w:pStyle w:val="TableCaptionOwn"/>
         <w:keepNext/>
-        <w:spacing w:before="240"/>
-      </w:pPr>
-      <w:r>
-        <w:t xml:space="preserve">Таблиця 25 – UVP для персони Ірина</w:t>
+        <w:spacing w:before="420"/>
+      </w:pPr>
+      <w:r>
+        <w:t xml:space="preserve">Таблиця 27 – UVP для персони Ірина</w:t>
       </w:r>
     </w:p>
     <w:tbl>
@@ -9214,8 +9331,8 @@
         <w:tblLook w:firstRow="1" w:lastRow="0" w:firstColumn="0" w:lastColumn="0" w:noHBand="0" w:noVBand="0" w:val="0020"/>
       </w:tblPr>
       <w:tblGrid>
-        <w:gridCol w:w="1742"/>
-        <w:gridCol w:w="6177"/>
+        <w:gridCol w:w="2455"/>
+        <w:gridCol w:w="5464"/>
       </w:tblGrid>
       <w:tr>
         <w:trPr>
@@ -9275,7 +9392,7 @@
               <w:jc w:val="left"/>
             </w:pPr>
             <w:r>
-              <w:t xml:space="preserve">Для вчителів з приватною практикою, які щонеділі зводять оплати в журналі, Classno – це україномовний журнал занять і оплат, що сам підбиває підсумок тижня по кожному учню. На відміну від англомовних програм для репетиторів, ним можна почати користуватися за один вечір без налаштувань</w:t>
+              <w:t xml:space="preserve">Для вчителів з приватною практикою, які щонеділі зводять оплати в журналі, Classno – це україномовний журнал занять і оплат, що сам підбиває підсумок тижня по кожному учню. На відміну від перевантажених програм для навчальних центрів, ним можна почати користуватися за один вечір без налаштувань</w:t>
             </w:r>
           </w:p>
         </w:tc>
@@ -9337,7 +9454,7 @@
               <w:jc w:val="left"/>
             </w:pPr>
             <w:r>
-              <w:t xml:space="preserve">«вечір неділі», «журнал», «готівкою і на картку», «батьки», «українською», «просто»</w:t>
+              <w:t xml:space="preserve">«вечір неділі», «журнал», «готівкою і на картку», «батьки», «без налаштувань», «просто»</w:t>
             </w:r>
           </w:p>
         </w:tc>
@@ -9366,7 +9483,7 @@
               <w:jc w:val="left"/>
             </w:pPr>
             <w:r>
-              <w:t xml:space="preserve">Англіцизми (dashboard, onboarding, CRM), «інноваційний», «стартап», складні тарифи, обіцянки замінити Viber</w:t>
+              <w:t xml:space="preserve">Технічний жаргон (dashboard, onboarding, CRM), «інноваційний», «стартап», складні тарифи, обіцянки замінити Viber</w:t>
             </w:r>
           </w:p>
         </w:tc>
@@ -9377,6 +9494,7 @@
     <w:p>
       <w:pPr>
         <w:pStyle w:val="Heading2"/>
+        <w:spacing w:before="420"/>
       </w:pPr>
       <w:r>
         <w:t xml:space="preserve">7.3. 5-секундний тест</w:t>
@@ -9387,7 +9505,7 @@
         <w:pStyle w:val="FirstParagraph"/>
       </w:pPr>
       <w:r>
-        <w:t xml:space="preserve">Тест проведено 03.10.2026 з трьома людьми, не знайомими з проєктом: одногрупником (21 рік, студент IT-спеціальності), знайомою бухгалтеркою (34 роки) і сусідом-інженером (58 років). Кожен UVP показували на екрані телефона 5 секунд, після чого ставили три запитання методички: що пропонує продукт, для кого і чим відрізняється від конкурентів [10]. Відповідь зараховувалась, якщо учасник правильно називав щонайменше продукт і аудиторію.</w:t>
+        <w:t xml:space="preserve">Тест проведено з трьома людьми, не знайомими з проєктом: одногрупником (21 рік, студент IT-спеціальності), знайомою бухгалтеркою (34 роки) і сусідом-інженером (58 років). Кожен UVP показували на екрані телефона 5 секунд, після чого ставили три запитання методички: що пропонує продукт, для кого і чим відрізняється від конкурентів [7]. Відповідь зараховувалась, якщо учасник правильно називав щонайменше продукт і аудиторію.</w:t>
       </w:r>
     </w:p>
     <w:p>
@@ -9396,7 +9514,7 @@
         <w:keepNext/>
       </w:pPr>
       <w:r>
-        <w:t xml:space="preserve">Таблиця 26 – Результати 5-секундного тесту</w:t>
+        <w:t xml:space="preserve">Таблиця 28 – Результати 5-секундного тесту</w:t>
       </w:r>
     </w:p>
     <w:tbl>
@@ -9407,12 +9525,12 @@
         <w:tblLook w:firstRow="1" w:lastRow="0" w:firstColumn="0" w:lastColumn="0" w:noHBand="0" w:noVBand="0" w:val="0020"/>
       </w:tblPr>
       <w:tblGrid>
-        <w:gridCol w:w="1108"/>
+        <w:gridCol w:w="1029"/>
+        <w:gridCol w:w="1425"/>
+        <w:gridCol w:w="1504"/>
         <w:gridCol w:w="1346"/>
+        <w:gridCol w:w="1267"/>
         <w:gridCol w:w="1346"/>
-        <w:gridCol w:w="1346"/>
-        <w:gridCol w:w="1029"/>
-        <w:gridCol w:w="1742"/>
       </w:tblGrid>
       <w:tr>
         <w:trPr>
@@ -9428,7 +9546,7 @@
               <w:jc w:val="center"/>
             </w:pPr>
             <w:r>
-              <w:t xml:space="preserve">UVP-варіант</w:t>
+              <w:t xml:space="preserve">Варіант</w:t>
             </w:r>
           </w:p>
         </w:tc>
@@ -9480,7 +9598,7 @@
               <w:jc w:val="center"/>
             </w:pPr>
             <w:r>
-              <w:t xml:space="preserve">Зрозумілий?</w:t>
+              <w:t xml:space="preserve">Підсумок</w:t>
             </w:r>
           </w:p>
         </w:tc>
@@ -9524,7 +9642,7 @@
               <w:jc w:val="left"/>
             </w:pPr>
             <w:r>
-              <w:t xml:space="preserve">✓ «застосунок для репетиторів, рахує борги»</w:t>
+              <w:t xml:space="preserve">✓ «програма для репетиторів, рахує борги»</w:t>
             </w:r>
           </w:p>
         </w:tc>
@@ -9563,20 +9681,20 @@
               <w:jc w:val="left"/>
             </w:pPr>
             <w:r>
-              <w:t xml:space="preserve">Частково (2/3)</w:t>
-            </w:r>
-          </w:p>
-        </w:tc>
-        <w:tc>
-          <w:tcPr/>
-          <w:p>
-            <w:pPr>
-              <w:pStyle w:val="Compact"/>
-              <w:keepNext/>
-              <w:jc w:val="left"/>
-            </w:pPr>
-            <w:r>
-              <w:t xml:space="preserve">Задовге: друге речення не встигають прочитати. Відмінність винести в підзаголовок</w:t>
+              <w:t xml:space="preserve">2/3, частково</w:t>
+            </w:r>
+          </w:p>
+        </w:tc>
+        <w:tc>
+          <w:tcPr/>
+          <w:p>
+            <w:pPr>
+              <w:pStyle w:val="Compact"/>
+              <w:keepNext/>
+              <w:jc w:val="left"/>
+            </w:pPr>
+            <w:r>
+              <w:t xml:space="preserve">Скоротити</w:t>
             </w:r>
           </w:p>
         </w:tc>
@@ -9646,7 +9764,7 @@
               <w:jc w:val="left"/>
             </w:pPr>
             <w:r>
-              <w:t xml:space="preserve">Так (3/3)</w:t>
+              <w:t xml:space="preserve">3/3, так</w:t>
             </w:r>
           </w:p>
         </w:tc>
@@ -9716,33 +9834,33 @@
               <w:jc w:val="left"/>
             </w:pPr>
             <w:r>
-              <w:t xml:space="preserve">✗ «програма українською для вчителів, а що робить – не зрозумів»</w:t>
-            </w:r>
-          </w:p>
-        </w:tc>
-        <w:tc>
-          <w:tcPr/>
-          <w:p>
-            <w:pPr>
-              <w:pStyle w:val="Compact"/>
-              <w:keepNext/>
-              <w:jc w:val="left"/>
-            </w:pPr>
-            <w:r>
-              <w:t xml:space="preserve">Ні (1/3)</w:t>
-            </w:r>
-          </w:p>
-        </w:tc>
-        <w:tc>
-          <w:tcPr/>
-          <w:p>
-            <w:pPr>
-              <w:pStyle w:val="Compact"/>
-              <w:keepNext/>
-              <w:jc w:val="left"/>
-            </w:pPr>
-            <w:r>
-              <w:t xml:space="preserve">Задовге, «підбиває підсумок» незрозуміло. Почати з дії: «рахує оплати»</w:t>
+              <w:t xml:space="preserve">✗ «програма для вчителів, а що робить – не зрозумів»</w:t>
+            </w:r>
+          </w:p>
+        </w:tc>
+        <w:tc>
+          <w:tcPr/>
+          <w:p>
+            <w:pPr>
+              <w:pStyle w:val="Compact"/>
+              <w:keepNext/>
+              <w:jc w:val="left"/>
+            </w:pPr>
+            <w:r>
+              <w:t xml:space="preserve">1/3, ні</w:t>
+            </w:r>
+          </w:p>
+        </w:tc>
+        <w:tc>
+          <w:tcPr/>
+          <w:p>
+            <w:pPr>
+              <w:pStyle w:val="Compact"/>
+              <w:keepNext/>
+              <w:jc w:val="left"/>
+            </w:pPr>
+            <w:r>
+              <w:t xml:space="preserve">Скоротити, почати з дії</w:t>
             </w:r>
           </w:p>
         </w:tc>
@@ -9795,31 +9913,31 @@
               <w:jc w:val="left"/>
             </w:pPr>
             <w:r>
-              <w:t xml:space="preserve">✗ «щось про вихідні, планувальник?»</w:t>
-            </w:r>
-          </w:p>
-        </w:tc>
-        <w:tc>
-          <w:tcPr/>
-          <w:p>
-            <w:pPr>
-              <w:pStyle w:val="Compact"/>
-              <w:jc w:val="left"/>
-            </w:pPr>
-            <w:r>
-              <w:t xml:space="preserve">Так (2/3)</w:t>
-            </w:r>
-          </w:p>
-        </w:tc>
-        <w:tc>
-          <w:tcPr/>
-          <w:p>
-            <w:pPr>
-              <w:pStyle w:val="Compact"/>
-              <w:jc w:val="left"/>
-            </w:pPr>
-            <w:r>
-              <w:t xml:space="preserve">«Неділя» без контексту сприймається як планувальник. Слово «оплати» поставити раніше</w:t>
+              <w:t xml:space="preserve">✗ «щось про вихідні, якийсь планер?»</w:t>
+            </w:r>
+          </w:p>
+        </w:tc>
+        <w:tc>
+          <w:tcPr/>
+          <w:p>
+            <w:pPr>
+              <w:pStyle w:val="Compact"/>
+              <w:jc w:val="left"/>
+            </w:pPr>
+            <w:r>
+              <w:t xml:space="preserve">2/3, так</w:t>
+            </w:r>
+          </w:p>
+        </w:tc>
+        <w:tc>
+          <w:tcPr/>
+          <w:p>
+            <w:pPr>
+              <w:pStyle w:val="Compact"/>
+              <w:jc w:val="left"/>
+            </w:pPr>
+            <w:r>
+              <w:t xml:space="preserve">«Оплати» поставити раніше</w:t>
             </w:r>
           </w:p>
         </w:tc>
@@ -9828,10 +9946,10 @@
     <w:p>
       <w:pPr>
         <w:pStyle w:val="BodyText"/>
-        <w:spacing w:before="240"/>
-      </w:pPr>
-      <w:r>
-        <w:t xml:space="preserve">Формат Бланка виявився зрозумілішим для обох персон: він коротший і починається з результату для користувача. Формат Мура корисний для внутрішнього позиціонування, але для 5 секунд він задовгий.</w:t>
+        <w:spacing w:before="420"/>
+      </w:pPr>
+      <w:r>
+        <w:t xml:space="preserve">Формат Мура для обох персон виявився задовгим: друге речення з відмінністю від конкурентів за 5 секунд не встигають прочитати, а вислів «підбиває підсумок» у варіанті Ірини учасники не зрозуміли. Відмінність варто винести в підзаголовок, а речення починати з дії – «рахує оплати». Формат Бланка зрозуміліший: він коротший і починається з результату для користувача. Єдине зауваження до варіанта Ірини – «неділю» без контексту один учасник сприйняв як планувальник, тому слово «оплати» треба поставити раніше. Формат Мура корисний для внутрішнього позиціонування, але для першого контакту задовгий.</w:t>
       </w:r>
     </w:p>
     <w:bookmarkEnd w:id="36"/>
@@ -9850,7 +9968,7 @@
         <w:keepNext/>
       </w:pPr>
       <w:r>
-        <w:t xml:space="preserve">Таблиця 27 – Фінальні UVP</w:t>
+        <w:t xml:space="preserve">Таблиця 29 – Фінальні UVP</w:t>
       </w:r>
     </w:p>
     <w:tbl>
@@ -9861,8 +9979,8 @@
         <w:tblLook w:firstRow="1" w:lastRow="0" w:firstColumn="0" w:lastColumn="0" w:noHBand="0" w:noVBand="0" w:val="0020"/>
       </w:tblPr>
       <w:tblGrid>
-        <w:gridCol w:w="1425"/>
-        <w:gridCol w:w="6494"/>
+        <w:gridCol w:w="2455"/>
+        <w:gridCol w:w="5464"/>
       </w:tblGrid>
       <w:tr>
         <w:trPr>
@@ -9960,7 +10078,7 @@
     <w:p>
       <w:pPr>
         <w:pStyle w:val="BodyText"/>
-        <w:spacing w:before="240"/>
+        <w:spacing w:before="420"/>
       </w:pPr>
       <w:r>
         <w:t xml:space="preserve">Обґрунтування:</w:t>
@@ -10157,7 +10275,7 @@
         <w:jc w:val="left"/>
       </w:pPr>
       <w:r>
-        <w:t xml:space="preserve">Ulwick A. W. Jobs to be Done: Theory to Practice. Idea Bite Press, 2016. URL: https://jobs-to-be-done-book.com/ (дата звернення: 04.10.2026).</w:t>
+        <w:t xml:space="preserve">Moesta B., Spiek C. Unpacking the Progress Making Forces Diagram. JTBD Radio. URL: https://jobstobedone.org/radio/unpacking-the-progress-making-forces-diagram/ (дата звернення: 04.10.2026).</w:t>
       </w:r>
     </w:p>
     <w:p>
@@ -10170,7 +10288,7 @@
         <w:jc w:val="left"/>
       </w:pPr>
       <w:r>
-        <w:t xml:space="preserve">Moesta B., Spiek C. Unpacking the Progress Making Forces Diagram. JTBD Radio. URL: https://jobstobedone.org/radio/unpacking-the-progress-making-forces-diagram/ (дата звернення: 04.10.2026).</w:t>
+        <w:t xml:space="preserve">Osterwalder A., Pigneur Y., Bernarda G., Smith A. Value Proposition Design: How to Create Products and Services Customers Want. Hoboken : Wiley, 2014. 320 p. URL: https://www.strategyzer.com/library/value-proposition-design-2 (дата звернення: 04.10.2026).</w:t>
       </w:r>
     </w:p>
     <w:p>
@@ -10183,7 +10301,7 @@
         <w:jc w:val="left"/>
       </w:pPr>
       <w:r>
-        <w:t xml:space="preserve">Christensen C. M., Hall T., Dillon K., Duncan D. S. Competing Against Luck: The Story of Innovation and Customer Choice. New York : HarperBusiness, 2016. 288 p. URL: https://www.christenseninstitute.org/book/competing-against-luck/ (дата звернення: 04.10.2026).</w:t>
+        <w:t xml:space="preserve">Design Thinking. IDEO. URL: https://designthinking.ideo.com/ (дата звернення: 04.10.2026).</w:t>
       </w:r>
     </w:p>
     <w:p>
@@ -10196,7 +10314,7 @@
         <w:jc w:val="left"/>
       </w:pPr>
       <w:r>
-        <w:t xml:space="preserve">Osterwalder A., Pigneur Y., Bernarda G., Smith A. Value Proposition Design: How to Create Products and Services Customers Want. Hoboken : Wiley, 2014. 320 p. URL: https://www.strategyzer.com/library/value-proposition-design-2 (дата звернення: 04.10.2026).</w:t>
+        <w:t xml:space="preserve">Moore G. A. Crossing the Chasm: Marketing and Selling Disruptive Products to Mainstream Customers. 3rd ed. New York : HarperBusiness, 2014. URL: https://geoffreyamoore.com/book/crossing-the-chasm/ (дата звернення: 04.10.2026).</w:t>
       </w:r>
     </w:p>
     <w:p>
@@ -10209,7 +10327,7 @@
         <w:jc w:val="left"/>
       </w:pPr>
       <w:r>
-        <w:t xml:space="preserve">Value Proposition Canvas – Download the Official Template. Strategyzer. URL: https://www.strategyzer.com/library/the-value-proposition-canvas (дата звернення: 04.10.2026).</w:t>
+        <w:t xml:space="preserve">Blank S. How To Build a Web Startup – Lean LaunchPad Edition. Steve Blank. 22.09.2011. URL: https://steveblank.com/2011/09/22/how-to-build-a-web-startup-lean-launchpad-edition/ (дата звернення: 04.10.2026).</w:t>
       </w:r>
     </w:p>
     <w:p>
@@ -10222,7 +10340,7 @@
         <w:jc w:val="left"/>
       </w:pPr>
       <w:r>
-        <w:t xml:space="preserve">Design Thinking. IDEO. URL: https://designthinking.ideo.com/ (дата звернення: 04.10.2026).</w:t>
+        <w:t xml:space="preserve">Five second testing guide: Definition &amp; key considerations. Lyssna. 28.08.2023. URL: https://www.lyssna.com/guides/five-second-testing-guide/ (дата звернення: 04.10.2026).</w:t>
       </w:r>
     </w:p>
     <w:p>
@@ -10235,7 +10353,7 @@
         <w:jc w:val="left"/>
       </w:pPr>
       <w:r>
-        <w:t xml:space="preserve">Moore G. A. Crossing the Chasm: Marketing and Selling Disruptive Products to Mainstream Customers. 3rd ed. New York : HarperBusiness, 2014. URL: https://geoffreyamoore.com/book/crossing-the-chasm/ (дата звернення: 04.10.2026).</w:t>
+        <w:t xml:space="preserve">TutorBird – The #1 Tutor Management Software. TutorBird. URL: https://www.tutorbird.com/ (дата звернення: 04.10.2026).</w:t>
       </w:r>
     </w:p>
     <w:p>
@@ -10248,7 +10366,7 @@
         <w:jc w:val="left"/>
       </w:pPr>
       <w:r>
-        <w:t xml:space="preserve">Blank S. How To Build a Web Startup – Lean LaunchPad Edition. Steve Blank. 22.09.2011. URL: https://steveblank.com/2011/09/22/how-to-build-a-web-startup-lean-launchpad-edition/ (дата звернення: 04.10.2026).</w:t>
+        <w:t xml:space="preserve">Teachworks. URL: https://teachworks.com/ (дата звернення: 04.10.2026).</w:t>
       </w:r>
     </w:p>
     <w:p>
@@ -10261,7 +10379,7 @@
         <w:jc w:val="left"/>
       </w:pPr>
       <w:r>
-        <w:t xml:space="preserve">Five second testing guide: Definition &amp; key considerations. Lyssna. 28.08.2023. URL: https://www.lyssna.com/guides/five-second-testing-guide/ (дата звернення: 04.10.2026).</w:t>
+        <w:t xml:space="preserve">My Music Staff. URL: https://www.mymusicstaff.com/ (дата звернення: 04.10.2026).</w:t>
       </w:r>
     </w:p>
     <w:p>
@@ -10274,7 +10392,7 @@
         <w:jc w:val="left"/>
       </w:pPr>
       <w:r>
-        <w:t xml:space="preserve">TutorBird – The #1 Tutor Management Software. TutorBird. URL: https://www.tutorbird.com/ (дата звернення: 04.10.2026).</w:t>
+        <w:t xml:space="preserve">ЯРепетитор. Google Play. URL: https://play.google.com/store/apps/details?id=studio.clapp.yarepetitor&amp;hl=uk (дата звернення: 04.10.2026).</w:t>
       </w:r>
     </w:p>
     <w:p>
@@ -10287,59 +10405,7 @@
         <w:jc w:val="left"/>
       </w:pPr>
       <w:r>
-        <w:t xml:space="preserve">Teachworks. URL: https://teachworks.com/ (дата звернення: 04.10.2026).</w:t>
-      </w:r>
-    </w:p>
-    <w:p>
-      <w:pPr>
-        <w:pStyle w:val="Compact"/>
-        <w:numPr>
-          <w:ilvl w:val="0"/>
-          <w:numId w:val="1007"/>
-        </w:numPr>
-        <w:jc w:val="left"/>
-      </w:pPr>
-      <w:r>
-        <w:t xml:space="preserve">My Music Staff. URL: https://www.mymusicstaff.com/ (дата звернення: 04.10.2026).</w:t>
-      </w:r>
-    </w:p>
-    <w:p>
-      <w:pPr>
-        <w:pStyle w:val="Compact"/>
-        <w:numPr>
-          <w:ilvl w:val="0"/>
-          <w:numId w:val="1007"/>
-        </w:numPr>
-        <w:jc w:val="left"/>
-      </w:pPr>
-      <w:r>
-        <w:t xml:space="preserve">ЯРепетитор. Google Play. URL: https://play.google.com/store/apps/details?id=studio.clapp.yarepetitor&amp;hl=uk (дата звернення: 04.10.2026).</w:t>
-      </w:r>
-    </w:p>
-    <w:p>
-      <w:pPr>
-        <w:pStyle w:val="Compact"/>
-        <w:numPr>
-          <w:ilvl w:val="0"/>
-          <w:numId w:val="1007"/>
-        </w:numPr>
-        <w:jc w:val="left"/>
-      </w:pPr>
-      <w:r>
         <w:t xml:space="preserve">TutorCruncher. URL: https://tutorcruncher.com/ (дата звернення: 04.10.2026).</w:t>
-      </w:r>
-    </w:p>
-    <w:p>
-      <w:pPr>
-        <w:pStyle w:val="Compact"/>
-        <w:numPr>
-          <w:ilvl w:val="0"/>
-          <w:numId w:val="1007"/>
-        </w:numPr>
-        <w:jc w:val="left"/>
-      </w:pPr>
-      <w:r>
-        <w:t xml:space="preserve">FigJam: online whiteboard for teams. Figma. URL: https://www.figma.com/figjam/ (дата звернення: 04.10.2026).</w:t>
       </w:r>
     </w:p>
     <w:bookmarkEnd w:id="41"/>
@@ -10369,8 +10435,8 @@
         <w:tblLook w:firstRow="1" w:lastRow="0" w:firstColumn="0" w:lastColumn="0" w:noHBand="0" w:noVBand="0" w:val="0020"/>
       </w:tblPr>
       <w:tblGrid>
-        <w:gridCol w:w="1584"/>
-        <w:gridCol w:w="6336"/>
+        <w:gridCol w:w="1821"/>
+        <w:gridCol w:w="6098"/>
       </w:tblGrid>
       <w:tr>
         <w:trPr>
@@ -10628,10 +10694,11 @@
     <w:multiLevelType w:val="multilevel"/>
     <w:lvl w:ilvl="0">
       <w:numFmt w:val="bullet"/>
+      <w:suff w:val="space"/>
       <w:lvlText w:val=" "/>
       <w:lvlJc w:val="left"/>
       <w:pPr>
-        <w:ind w:left="720" w:hanging="360"/>
+        <w:ind w:left="0" w:firstLine="709"/>
       </w:pPr>
     </w:lvl>
     <w:lvl w:ilvl="1">
@@ -10705,10 +10772,11 @@
     <w:lvl w:ilvl="0">
       <w:start w:val="1"/>
       <w:numFmt w:val="decimal"/>
+      <w:suff w:val="space"/>
       <w:lvlText w:val="%1."/>
       <w:lvlJc w:val="left"/>
       <w:pPr>
-        <w:ind w:left="720" w:hanging="360"/>
+        <w:ind w:left="0" w:firstLine="709"/>
       </w:pPr>
     </w:lvl>
     <w:lvl w:ilvl="1">

</xml_diff>